<commit_message>
docs: sync per-app trade-analyzer guide + isotonic calibration + test counts
trade-analyzer/CLAUDE.md: add markov/factors/backtest modules + an offline swing-fit section + baseline 251. Root CLAUDE.md + technical-reference: document isotonic calibration smoothing, the 'excess' headline label, and current test counts (webgui 552, trade_svc 56, contracts 37).

Co-Authored-By: Claude Opus 4.8 <noreply@anthropic.com>
</commit_message>
<xml_diff>
--- a/docs/manuals/technical-reference/technical-reference.docx
+++ b/docs/manuals/technical-reference/technical-reference.docx
@@ -8027,9 +8027,24 @@
         <w:t>hit-rate = P(forward &gt; 0)</w:t>
       </w:r>
       <w:r>
-        <w:t>. This replaces the old</w:t>
+        <w:t>. The mean-forward and</w:t>
         <w:br/>
-        <w:t xml:space="preserve">  ±40 score cuts — the BUY/SELL bands are the top/bottom calibrated bands.</w:t>
+        <w:t xml:space="preserve">  hit-rate are </w:t>
+      </w:r>
+      <w:r>
+        <w:rPr>
+          <w:b/>
+        </w:rPr>
+        <w:t>isotonic (pool-adjacent-violators) smoothed</w:t>
+      </w:r>
+      <w:r>
+        <w:t xml:space="preserve"> across the score-ordered</w:t>
+        <w:br/>
+        <w:t xml:space="preserve">  bands, so thin-signal sampling noise can't make a higher-ranked band show a lower stat.</w:t>
+        <w:br/>
+        <w:t xml:space="preserve">  This replaces the old ±40 score cuts — the BUY/SELL bands are the top/bottom calibrated</w:t>
+        <w:br/>
+        <w:t xml:space="preserve">  bands.</w:t>
       </w:r>
     </w:p>
     <w:p>

</xml_diff>